<commit_message>
feat: ajoute le catalogue de formations au mémoire technique
Résumé des 11 modules de sensibilisation RSE (certifiés Qualiopi) et
ateliers collaboratifs (Fresque du Climat, etc.) dans une nouvelle
section du template MEMOIRE.docx.
</commit_message>
<xml_diff>
--- a/assets/templates/MEMOIRE.docx
+++ b/assets/templates/MEMOIRE.docx
@@ -730,6 +730,137 @@
         <w:t xml:space="preserve">Mesure de la performance et amélioration continue</w:t>
       </w:r>
     </w:p>
+    <w:p>
+      <w:pPr>
+        <w:pBdr>
+          <w:bottom w:val="single" w:color="2E75B6" w:sz="6" w:space="1"/>
+        </w:pBdr>
+        <w:spacing w:after="200"/>
+      </w:pPr>
+      <w:r>
+        <w:t xml:space="preserve"/>
+      </w:r>
+    </w:p>
+    <w:p>
+      <w:pPr>
+        <w:pStyle w:val="Heading2"/>
+      </w:pPr>
+      <w:r>
+        <w:t xml:space="preserve">7. Catalogue de formations (organisme certifié Qualiopi)</w:t>
+      </w:r>
+    </w:p>
+    <w:p>
+      <w:pPr>
+        <w:spacing w:after="120"/>
+      </w:pPr>
+      <w:r>
+        <w:t xml:space="preserve">nam &amp; kouji dispense des formations et ateliers de sensibilisation RSE, en ligne (360Learning) ou en présentiel, sans prérequis. Catalogue complet disponible sur demande.</w:t>
+      </w:r>
+    </w:p>
+    <w:p>
+      <w:pPr>
+        <w:pStyle w:val="ListParagraph"/>
+        <w:numPr>
+          <w:ilvl w:val="0"/>
+          <w:numId w:val="2"/>
+        </w:numPr>
+        <w:spacing w:after="60"/>
+      </w:pPr>
+      <w:r>
+        <w:t xml:space="preserve">Sensibilisation à l’éthique professionnelle, à la diversité, à la prévention du harcèlement, à la cybersécurité</w:t>
+      </w:r>
+    </w:p>
+    <w:p>
+      <w:pPr>
+        <w:pStyle w:val="ListParagraph"/>
+        <w:numPr>
+          <w:ilvl w:val="0"/>
+          <w:numId w:val="2"/>
+        </w:numPr>
+        <w:spacing w:after="60"/>
+      </w:pPr>
+      <w:r>
+        <w:t xml:space="preserve">Gouvernance responsable, droits humains, intégrité et lutte contre la corruption</w:t>
+      </w:r>
+    </w:p>
+    <w:p>
+      <w:pPr>
+        <w:pStyle w:val="ListParagraph"/>
+        <w:numPr>
+          <w:ilvl w:val="0"/>
+          <w:numId w:val="2"/>
+        </w:numPr>
+        <w:spacing w:after="60"/>
+      </w:pPr>
+      <w:r>
+        <w:t xml:space="preserve">Éco-gestes, protection des données, sensibilisation aux enjeux de l’IA, engagement sociétal</w:t>
+      </w:r>
+    </w:p>
+    <w:p>
+      <w:pPr>
+        <w:pStyle w:val="ListParagraph"/>
+        <w:numPr>
+          <w:ilvl w:val="0"/>
+          <w:numId w:val="2"/>
+        </w:numPr>
+        <w:spacing w:after="60"/>
+      </w:pPr>
+      <w:r>
+        <w:t xml:space="preserve">Ateliers collaboratifs : Fresque du Climat, Fresque de la Biodiversité, Fresque du Numérique, Atelier 2 Tonnes</w:t>
+      </w:r>
+    </w:p>
+    <w:p>
+      <w:pPr>
+        <w:pStyle w:val="ListParagraph"/>
+        <w:numPr>
+          <w:ilvl w:val="0"/>
+          <w:numId w:val="2"/>
+        </w:numPr>
+        <w:spacing w:after="60"/>
+      </w:pPr>
+      <w:r>
+        <w:t xml:space="preserve">Raison d’être, entreprise à mission, communication responsable et anti-greenwashing</w:t>
+      </w:r>
+    </w:p>
+    <w:p>
+      <w:pPr>
+        <w:pStyle w:val="ListParagraph"/>
+        <w:numPr>
+          <w:ilvl w:val="0"/>
+          <w:numId w:val="2"/>
+        </w:numPr>
+        <w:spacing w:after="60"/>
+      </w:pPr>
+      <w:r>
+        <w:t xml:space="preserve">Obtention de labels RSE (Lucie, Afnor, PME+, B-Corp) et de la médaille EcoVadis</w:t>
+      </w:r>
+    </w:p>
+    <w:p>
+      <w:pPr>
+        <w:pStyle w:val="ListParagraph"/>
+        <w:numPr>
+          <w:ilvl w:val="0"/>
+          <w:numId w:val="2"/>
+        </w:numPr>
+        <w:spacing w:after="60"/>
+      </w:pPr>
+      <w:r>
+        <w:t xml:space="preserve">CSRD, construction de rapport RSE, comptabilité et stratégie carbone</w:t>
+      </w:r>
+    </w:p>
+    <w:p>
+      <w:pPr>
+        <w:pStyle w:val="ListParagraph"/>
+        <w:numPr>
+          <w:ilvl w:val="0"/>
+          <w:numId w:val="2"/>
+        </w:numPr>
+        <w:spacing w:after="60"/>
+      </w:pPr>
+      <w:r>
+        <w:t xml:space="preserve">Handicap en entreprise, en partenariat avec Yvan Wouandji (porte-drapeau Jeux Paralympiques Paris 2024)</w:t>
+      </w:r>
+    </w:p>
     <w:sectPr>
       <w:pgSz w:w="11906" w:h="16838" w:orient="portrait"/>
       <w:pgMar w:top="1134" w:right="1134" w:bottom="1134" w:left="1134" w:header="708" w:footer="708" w:gutter="0"/>

</xml_diff>